<commit_message>
Add author ORCID to title page
Co-Authored-By: Claude Sonnet 5 <noreply@anthropic.com>
</commit_message>
<xml_diff>
--- a/paper/tex/title-page.docx
+++ b/paper/tex/title-page.docx
@@ -232,26 +232,19 @@
         <w:t xml:space="preserve"> </w:t>
       </w:r>
       <w:r>
-        <w:rPr>
-          <w:i/>
-          <w:iCs/>
-        </w:rPr>
-        <w:t xml:space="preserve">[to be added by the author, if available:</w:t>
-      </w:r>
-      <w:r>
-        <w:rPr>
-          <w:i/>
-          <w:iCs/>
-        </w:rPr>
-        <w:t xml:space="preserve"> </w:t>
-      </w:r>
-      <w:r>
-        <w:rPr>
-          <w:i/>
-          <w:iCs/>
-        </w:rPr>
-        <w:t xml:space="preserve">https://orcid.org]</w:t>
-      </w:r>
+        <w:t xml:space="preserve">Quang-Vinh Dang:</w:t>
+      </w:r>
+      <w:r>
+        <w:t xml:space="preserve"> </w:t>
+      </w:r>
+      <w:hyperlink r:id="rId10">
+        <w:r>
+          <w:rPr>
+            <w:rStyle w:val="Hyperlink"/>
+          </w:rPr>
+          <w:t xml:space="preserve">0000-0002-3877-8024</w:t>
+        </w:r>
+      </w:hyperlink>
     </w:p>
     <w:p>
       <w:r>

</xml_diff>